<commit_message>
fix: move Oneng Sumarni to tidak_acc_layak_huni, remove duplicate ONENG entry
- Oneng Sumarni (entry 47) changed from data_acc to tidak_acc_layak_huni
- Keterangan: Diganti oleh Tomi Harun Arasyid
- Removed duplicate entry 56 (ONENG) since it's the same person
- Photos already exist at /dokumentasi/lampegan/oneng sumarni
- Lampegan: 15 data_acc, 7 diganti, 1 tidak melanjutkan
- Regenerated Excel, Word, PDF documents
</commit_message>
<xml_diff>
--- a/public/outputs/Data_BSPS_Paseh_Loa_Lampegan.docx
+++ b/public/outputs/Data_BSPS_Paseh_Loa_Lampegan.docx
@@ -71,17 +71,15 @@
     </w:p>
     <w:p>
       <w:pPr>
-        <w:jc w:val="center"/>
+        <w:pStyle w:val="Heading2"/>
       </w:pPr>
       <w:r>
         <w:rPr>
-          <w:b/>
-          <w:sz w:val="32"/>
+          <w:color w:val="2E7D32"/>
         </w:rPr>
         <w:t>DAFTAR ISI</w:t>
       </w:r>
     </w:p>
-    <w:p/>
     <w:p>
       <w:r>
         <w:rPr>
@@ -136,7 +134,7 @@
           <w:i/>
           <w:sz w:val="20"/>
         </w:rPr>
-        <w:t>Jumlah: 36 data</w:t>
+        <w:t>Jumlah: 35 data</w:t>
       </w:r>
     </w:p>
     <w:tbl>
@@ -4729,7 +4727,7 @@
               <w:rPr>
                 <w:sz w:val="14"/>
               </w:rPr>
-              <w:t>ONENG SUMARNI</w:t>
+              <w:t>ENCAR</w:t>
             </w:r>
           </w:p>
         </w:tc>
@@ -4742,7 +4740,7 @@
               <w:rPr>
                 <w:sz w:val="14"/>
               </w:rPr>
-              <w:t>3204364808810005</w:t>
+              <w:t>-</w:t>
             </w:r>
           </w:p>
         </w:tc>
@@ -4755,7 +4753,7 @@
               <w:rPr>
                 <w:sz w:val="14"/>
               </w:rPr>
-              <w:t>3204361903057024</w:t>
+              <w:t>-</w:t>
             </w:r>
           </w:p>
         </w:tc>
@@ -4768,7 +4766,7 @@
               <w:rPr>
                 <w:sz w:val="14"/>
               </w:rPr>
-              <w:t>Kp Lampegan</w:t>
+              <w:t>KP. Awilega RT 3 RW 9</w:t>
             </w:r>
           </w:p>
         </w:tc>
@@ -4781,7 +4779,7 @@
               <w:rPr>
                 <w:sz w:val="14"/>
               </w:rPr>
-              <w:t>-</w:t>
+              <w:t>3</w:t>
             </w:r>
           </w:p>
         </w:tc>
@@ -4794,7 +4792,7 @@
               <w:rPr>
                 <w:sz w:val="14"/>
               </w:rPr>
-              <w:t>-</w:t>
+              <w:t>9</w:t>
             </w:r>
           </w:p>
         </w:tc>
@@ -4833,7 +4831,7 @@
               <w:rPr>
                 <w:sz w:val="14"/>
               </w:rPr>
-              <w:t>Backlog 2 Desil 3</w:t>
+              <w:t>Backlog 2 - Pengganti Wawan Setiawan</w:t>
             </w:r>
           </w:p>
         </w:tc>
@@ -4849,138 +4847,6 @@
                 <w:sz w:val="14"/>
               </w:rPr>
               <w:t>35</w:t>
-            </w:r>
-          </w:p>
-        </w:tc>
-        <w:tc>
-          <w:tcPr>
-            <w:tcW w:type="dxa" w:w="1984"/>
-          </w:tcPr>
-          <w:p>
-            <w:r>
-              <w:rPr>
-                <w:sz w:val="14"/>
-              </w:rPr>
-              <w:t>ENCAR</w:t>
-            </w:r>
-          </w:p>
-        </w:tc>
-        <w:tc>
-          <w:tcPr>
-            <w:tcW w:type="dxa" w:w="1984"/>
-          </w:tcPr>
-          <w:p>
-            <w:r>
-              <w:rPr>
-                <w:sz w:val="14"/>
-              </w:rPr>
-              <w:t>-</w:t>
-            </w:r>
-          </w:p>
-        </w:tc>
-        <w:tc>
-          <w:tcPr>
-            <w:tcW w:type="dxa" w:w="1984"/>
-          </w:tcPr>
-          <w:p>
-            <w:r>
-              <w:rPr>
-                <w:sz w:val="14"/>
-              </w:rPr>
-              <w:t>-</w:t>
-            </w:r>
-          </w:p>
-        </w:tc>
-        <w:tc>
-          <w:tcPr>
-            <w:tcW w:type="dxa" w:w="3969"/>
-          </w:tcPr>
-          <w:p>
-            <w:r>
-              <w:rPr>
-                <w:sz w:val="14"/>
-              </w:rPr>
-              <w:t>KP. Awilega RT 3 RW 9</w:t>
-            </w:r>
-          </w:p>
-        </w:tc>
-        <w:tc>
-          <w:tcPr>
-            <w:tcW w:type="dxa" w:w="680"/>
-          </w:tcPr>
-          <w:p>
-            <w:r>
-              <w:rPr>
-                <w:sz w:val="14"/>
-              </w:rPr>
-              <w:t>3</w:t>
-            </w:r>
-          </w:p>
-        </w:tc>
-        <w:tc>
-          <w:tcPr>
-            <w:tcW w:type="dxa" w:w="680"/>
-          </w:tcPr>
-          <w:p>
-            <w:r>
-              <w:rPr>
-                <w:sz w:val="14"/>
-              </w:rPr>
-              <w:t>9</w:t>
-            </w:r>
-          </w:p>
-        </w:tc>
-        <w:tc>
-          <w:tcPr>
-            <w:tcW w:type="dxa" w:w="1701"/>
-          </w:tcPr>
-          <w:p>
-            <w:r>
-              <w:rPr>
-                <w:sz w:val="14"/>
-              </w:rPr>
-              <w:t>Lampegan</w:t>
-            </w:r>
-          </w:p>
-        </w:tc>
-        <w:tc>
-          <w:tcPr>
-            <w:tcW w:type="dxa" w:w="1701"/>
-          </w:tcPr>
-          <w:p>
-            <w:r>
-              <w:rPr>
-                <w:sz w:val="14"/>
-              </w:rPr>
-              <w:t>Ibun</w:t>
-            </w:r>
-          </w:p>
-        </w:tc>
-        <w:tc>
-          <w:tcPr>
-            <w:tcW w:type="dxa" w:w="2835"/>
-          </w:tcPr>
-          <w:p>
-            <w:r>
-              <w:rPr>
-                <w:sz w:val="14"/>
-              </w:rPr>
-              <w:t>Backlog 2 - Pengganti Wawan Setiawan</w:t>
-            </w:r>
-          </w:p>
-        </w:tc>
-      </w:tr>
-      <w:tr>
-        <w:tc>
-          <w:tcPr>
-            <w:tcW w:type="dxa" w:w="567"/>
-          </w:tcPr>
-          <w:p>
-            <w:r>
-              <w:rPr>
-                <w:sz w:val="14"/>
-              </w:rPr>
-              <w:t>36</w:t>
             </w:r>
           </w:p>
         </w:tc>
@@ -6815,7 +6681,7 @@
               <w:rPr>
                 <w:sz w:val="14"/>
               </w:rPr>
-              <w:t>ARIEF MOCHAMAD IKBAL</w:t>
+              <w:t>ONENG SUMARNI</w:t>
             </w:r>
           </w:p>
         </w:tc>
@@ -6828,7 +6694,7 @@
               <w:rPr>
                 <w:sz w:val="14"/>
               </w:rPr>
-              <w:t>3204360103920008</w:t>
+              <w:t>3204364808810005</w:t>
             </w:r>
           </w:p>
         </w:tc>
@@ -6841,7 +6707,7 @@
               <w:rPr>
                 <w:sz w:val="14"/>
               </w:rPr>
-              <w:t>3204361302180005</w:t>
+              <w:t>3204361903057024</w:t>
             </w:r>
           </w:p>
         </w:tc>
@@ -6854,7 +6720,7 @@
               <w:rPr>
                 <w:sz w:val="14"/>
               </w:rPr>
-              <w:t>KP. Babakan Salam RT 2 RW 7</w:t>
+              <w:t>Kp Lampegan</w:t>
             </w:r>
           </w:p>
         </w:tc>
@@ -6867,7 +6733,7 @@
               <w:rPr>
                 <w:sz w:val="14"/>
               </w:rPr>
-              <w:t>2</w:t>
+              <w:t>-</w:t>
             </w:r>
           </w:p>
         </w:tc>
@@ -6880,7 +6746,7 @@
               <w:rPr>
                 <w:sz w:val="14"/>
               </w:rPr>
-              <w:t>7</w:t>
+              <w:t>-</w:t>
             </w:r>
           </w:p>
         </w:tc>
@@ -6919,7 +6785,7 @@
               <w:rPr>
                 <w:sz w:val="14"/>
               </w:rPr>
-              <w:t>Diganti oleh Andri</w:t>
+              <w:t>Diganti oleh Tomi Harun Arasyid</w:t>
             </w:r>
           </w:p>
         </w:tc>
@@ -6947,7 +6813,7 @@
               <w:rPr>
                 <w:sz w:val="14"/>
               </w:rPr>
-              <w:t>YATI</w:t>
+              <w:t>ARIEF MOCHAMAD IKBAL</w:t>
             </w:r>
           </w:p>
         </w:tc>
@@ -6960,7 +6826,7 @@
               <w:rPr>
                 <w:sz w:val="14"/>
               </w:rPr>
-              <w:t>3204364802550002</w:t>
+              <w:t>3204360103920008</w:t>
             </w:r>
           </w:p>
         </w:tc>
@@ -6973,7 +6839,7 @@
               <w:rPr>
                 <w:sz w:val="14"/>
               </w:rPr>
-              <w:t>3204363108120020</w:t>
+              <w:t>3204361302180005</w:t>
             </w:r>
           </w:p>
         </w:tc>
@@ -6986,7 +6852,7 @@
               <w:rPr>
                 <w:sz w:val="14"/>
               </w:rPr>
-              <w:t>KP. Jolok RT 2 RW 6</w:t>
+              <w:t>KP. Babakan Salam RT 2 RW 7</w:t>
             </w:r>
           </w:p>
         </w:tc>
@@ -7012,7 +6878,7 @@
               <w:rPr>
                 <w:sz w:val="14"/>
               </w:rPr>
-              <w:t>6</w:t>
+              <w:t>7</w:t>
             </w:r>
           </w:p>
         </w:tc>
@@ -7051,7 +6917,7 @@
               <w:rPr>
                 <w:sz w:val="14"/>
               </w:rPr>
-              <w:t>Diganti oleh Memen</w:t>
+              <w:t>Diganti oleh Andri</w:t>
             </w:r>
           </w:p>
         </w:tc>
@@ -7079,7 +6945,7 @@
               <w:rPr>
                 <w:sz w:val="14"/>
               </w:rPr>
-              <w:t>ROHMAT</w:t>
+              <w:t>YATI</w:t>
             </w:r>
           </w:p>
         </w:tc>
@@ -7092,7 +6958,7 @@
               <w:rPr>
                 <w:sz w:val="14"/>
               </w:rPr>
-              <w:t>3204363001760001</w:t>
+              <w:t>3204364802550002</w:t>
             </w:r>
           </w:p>
         </w:tc>
@@ -7105,7 +6971,7 @@
               <w:rPr>
                 <w:sz w:val="14"/>
               </w:rPr>
-              <w:t>3204361809080057</w:t>
+              <w:t>3204363108120020</w:t>
             </w:r>
           </w:p>
         </w:tc>
@@ -7118,7 +6984,7 @@
               <w:rPr>
                 <w:sz w:val="14"/>
               </w:rPr>
-              <w:t>KP. Jolok RT 1 RW 6</w:t>
+              <w:t>KP. Jolok RT 2 RW 6</w:t>
             </w:r>
           </w:p>
         </w:tc>
@@ -7131,7 +6997,7 @@
               <w:rPr>
                 <w:sz w:val="14"/>
               </w:rPr>
-              <w:t>1</w:t>
+              <w:t>2</w:t>
             </w:r>
           </w:p>
         </w:tc>
@@ -7183,7 +7049,7 @@
               <w:rPr>
                 <w:sz w:val="14"/>
               </w:rPr>
-              <w:t>Diganti oleh Sodikin</w:t>
+              <w:t>Diganti oleh Memen</w:t>
             </w:r>
           </w:p>
         </w:tc>
@@ -7211,7 +7077,7 @@
               <w:rPr>
                 <w:sz w:val="14"/>
               </w:rPr>
-              <w:t>ASIH</w:t>
+              <w:t>ROHMAT</w:t>
             </w:r>
           </w:p>
         </w:tc>
@@ -7224,7 +7090,7 @@
               <w:rPr>
                 <w:sz w:val="14"/>
               </w:rPr>
-              <w:t>3204364907640002</w:t>
+              <w:t>3204363001760001</w:t>
             </w:r>
           </w:p>
         </w:tc>
@@ -7237,7 +7103,7 @@
               <w:rPr>
                 <w:sz w:val="14"/>
               </w:rPr>
-              <w:t>3204362406140007</w:t>
+              <w:t>3204361809080057</w:t>
             </w:r>
           </w:p>
         </w:tc>
@@ -7250,7 +7116,7 @@
               <w:rPr>
                 <w:sz w:val="14"/>
               </w:rPr>
-              <w:t>KP. Babakan Salam RT 1 RW 7</w:t>
+              <w:t>KP. Jolok RT 1 RW 6</w:t>
             </w:r>
           </w:p>
         </w:tc>
@@ -7276,7 +7142,7 @@
               <w:rPr>
                 <w:sz w:val="14"/>
               </w:rPr>
-              <w:t>7</w:t>
+              <w:t>6</w:t>
             </w:r>
           </w:p>
         </w:tc>
@@ -7315,7 +7181,7 @@
               <w:rPr>
                 <w:sz w:val="14"/>
               </w:rPr>
-              <w:t>Diganti oleh Dedeh</w:t>
+              <w:t>Diganti oleh Sodikin</w:t>
             </w:r>
           </w:p>
         </w:tc>
@@ -7343,7 +7209,7 @@
               <w:rPr>
                 <w:sz w:val="14"/>
               </w:rPr>
-              <w:t>WAWAN SETIAWAN</w:t>
+              <w:t>ASIH</w:t>
             </w:r>
           </w:p>
         </w:tc>
@@ -7356,7 +7222,7 @@
               <w:rPr>
                 <w:sz w:val="14"/>
               </w:rPr>
-              <w:t>3204360204940003</w:t>
+              <w:t>3204364907640002</w:t>
             </w:r>
           </w:p>
         </w:tc>
@@ -7369,7 +7235,7 @@
               <w:rPr>
                 <w:sz w:val="14"/>
               </w:rPr>
-              <w:t>3204360404180010</w:t>
+              <w:t>3204362406140007</w:t>
             </w:r>
           </w:p>
         </w:tc>
@@ -7382,7 +7248,7 @@
               <w:rPr>
                 <w:sz w:val="14"/>
               </w:rPr>
-              <w:t>KP. Awilega RT 3 RW 9</w:t>
+              <w:t>KP. Babakan Salam RT 1 RW 7</w:t>
             </w:r>
           </w:p>
         </w:tc>
@@ -7395,7 +7261,7 @@
               <w:rPr>
                 <w:sz w:val="14"/>
               </w:rPr>
-              <w:t>3</w:t>
+              <w:t>1</w:t>
             </w:r>
           </w:p>
         </w:tc>
@@ -7408,7 +7274,7 @@
               <w:rPr>
                 <w:sz w:val="14"/>
               </w:rPr>
-              <w:t>9</w:t>
+              <w:t>7</w:t>
             </w:r>
           </w:p>
         </w:tc>
@@ -7447,7 +7313,7 @@
               <w:rPr>
                 <w:sz w:val="14"/>
               </w:rPr>
-              <w:t>Diganti oleh Encar</w:t>
+              <w:t>Diganti oleh Dedeh</w:t>
             </w:r>
           </w:p>
         </w:tc>
@@ -7475,7 +7341,7 @@
               <w:rPr>
                 <w:sz w:val="14"/>
               </w:rPr>
-              <w:t>AI MARYATI</w:t>
+              <w:t>WAWAN SETIAWAN</w:t>
             </w:r>
           </w:p>
         </w:tc>
@@ -7488,7 +7354,7 @@
               <w:rPr>
                 <w:sz w:val="14"/>
               </w:rPr>
-              <w:t>3204365206620003</w:t>
+              <w:t>3204360204940003</w:t>
             </w:r>
           </w:p>
         </w:tc>
@@ -7501,7 +7367,7 @@
               <w:rPr>
                 <w:sz w:val="14"/>
               </w:rPr>
-              <w:t>3204361903051928</w:t>
+              <w:t>3204360404180010</w:t>
             </w:r>
           </w:p>
         </w:tc>
@@ -7514,7 +7380,7 @@
               <w:rPr>
                 <w:sz w:val="14"/>
               </w:rPr>
-              <w:t>Babakan Salam</w:t>
+              <w:t>KP. Awilega RT 3 RW 9</w:t>
             </w:r>
           </w:p>
         </w:tc>
@@ -7527,7 +7393,7 @@
               <w:rPr>
                 <w:sz w:val="14"/>
               </w:rPr>
-              <w:t>-</w:t>
+              <w:t>3</w:t>
             </w:r>
           </w:p>
         </w:tc>
@@ -7540,7 +7406,7 @@
               <w:rPr>
                 <w:sz w:val="14"/>
               </w:rPr>
-              <w:t>-</w:t>
+              <w:t>9</w:t>
             </w:r>
           </w:p>
         </w:tc>
@@ -7579,7 +7445,7 @@
               <w:rPr>
                 <w:sz w:val="14"/>
               </w:rPr>
-              <w:t>Diganti oleh Cecep</w:t>
+              <w:t>Diganti oleh Encar</w:t>
             </w:r>
           </w:p>
         </w:tc>
@@ -7607,7 +7473,7 @@
               <w:rPr>
                 <w:sz w:val="14"/>
               </w:rPr>
-              <w:t>ONENG</w:t>
+              <w:t>AI MARYATI</w:t>
             </w:r>
           </w:p>
         </w:tc>
@@ -7620,13 +7486,52 @@
               <w:rPr>
                 <w:sz w:val="14"/>
               </w:rPr>
+              <w:t>3204365206620003</w:t>
+            </w:r>
+          </w:p>
+        </w:tc>
+        <w:tc>
+          <w:tcPr>
+            <w:tcW w:type="dxa" w:w="1984"/>
+          </w:tcPr>
+          <w:p>
+            <w:r>
+              <w:rPr>
+                <w:sz w:val="14"/>
+              </w:rPr>
+              <w:t>3204361903051928</w:t>
+            </w:r>
+          </w:p>
+        </w:tc>
+        <w:tc>
+          <w:tcPr>
+            <w:tcW w:type="dxa" w:w="3969"/>
+          </w:tcPr>
+          <w:p>
+            <w:r>
+              <w:rPr>
+                <w:sz w:val="14"/>
+              </w:rPr>
+              <w:t>Babakan Salam</w:t>
+            </w:r>
+          </w:p>
+        </w:tc>
+        <w:tc>
+          <w:tcPr>
+            <w:tcW w:type="dxa" w:w="680"/>
+          </w:tcPr>
+          <w:p>
+            <w:r>
+              <w:rPr>
+                <w:sz w:val="14"/>
+              </w:rPr>
               <w:t>-</w:t>
             </w:r>
           </w:p>
         </w:tc>
         <w:tc>
           <w:tcPr>
-            <w:tcW w:type="dxa" w:w="1984"/>
+            <w:tcW w:type="dxa" w:w="680"/>
           </w:tcPr>
           <w:p>
             <w:r>
@@ -7639,45 +7544,6 @@
         </w:tc>
         <w:tc>
           <w:tcPr>
-            <w:tcW w:type="dxa" w:w="3969"/>
-          </w:tcPr>
-          <w:p>
-            <w:r>
-              <w:rPr>
-                <w:sz w:val="14"/>
-              </w:rPr>
-              <w:t>Kp Lampegan</w:t>
-            </w:r>
-          </w:p>
-        </w:tc>
-        <w:tc>
-          <w:tcPr>
-            <w:tcW w:type="dxa" w:w="680"/>
-          </w:tcPr>
-          <w:p>
-            <w:r>
-              <w:rPr>
-                <w:sz w:val="14"/>
-              </w:rPr>
-              <w:t>-</w:t>
-            </w:r>
-          </w:p>
-        </w:tc>
-        <w:tc>
-          <w:tcPr>
-            <w:tcW w:type="dxa" w:w="680"/>
-          </w:tcPr>
-          <w:p>
-            <w:r>
-              <w:rPr>
-                <w:sz w:val="14"/>
-              </w:rPr>
-              <w:t>-</w:t>
-            </w:r>
-          </w:p>
-        </w:tc>
-        <w:tc>
-          <w:tcPr>
             <w:tcW w:type="dxa" w:w="1701"/>
           </w:tcPr>
           <w:p>
@@ -7711,7 +7577,7 @@
               <w:rPr>
                 <w:sz w:val="14"/>
               </w:rPr>
-              <w:t>Diganti oleh Tomi Harun Arasyid</w:t>
+              <w:t>Diganti oleh Cecep</w:t>
             </w:r>
           </w:p>
         </w:tc>
@@ -8519,7 +8385,7 @@
               <w:rPr>
                 <w:sz w:val="20"/>
               </w:rPr>
-              <w:t>16</w:t>
+              <w:t>15</w:t>
             </w:r>
           </w:p>
         </w:tc>
@@ -8681,7 +8547,7 @@
                 <w:b/>
                 <w:sz w:val="20"/>
               </w:rPr>
-              <w:t>56</w:t>
+              <w:t>55</w:t>
             </w:r>
           </w:p>
         </w:tc>

</xml_diff>